<commit_message>
Added some pretty Padding in the CLI and Updated Documentation on the CLI programs.
</commit_message>
<xml_diff>
--- a/docs/Hardware Entropy.docx
+++ b/docs/Hardware Entropy.docx
@@ -34453,6 +34453,16 @@
         </w:tc>
       </w:tr>
     </w:tbl>
+    <w:p>
+      <w:r>
+        <w:t>10.5 Host-Side Entropy CLI Test Bench</w:t>
+      </w:r>
+    </w:p>
+    <w:p>
+      <w:r>
+        <w:t>To validate the backend entropy pool, cryptographic routines, and NIST randomness quality independently before full gateway integration, an interactive command-line test bench (EntropyCLI.exe, launched via scripts/runEntropy.bat) is provided. This standalone C++ utility interacts with the entropy subsystem to display real-time fill level and throughput speedometers, generate and format test random blocks (Hex, Base64, raw bitstreams, integer dice/coin rolls), test PBKDF2 and AES-256-GCM encryption/decryption round trips, toggle hardware/software entropy sources and whitening algorithms (Galois LFSR vs NIST SP 800-90B SHA-256), and execute the NIST SP 800-22 statistical test suite. In exhaustive test mode, the CLI generates a 10-bin p-value distribution histogram against the theoretical uniform distribution baseline to mathematically certify cryptographic randomness.</w:t>
+      </w:r>
+    </w:p>
     <w:p>
       <w:pPr>
         <w:rPr>

</xml_diff>